<commit_message>
docs: actualizar documentacion ISO de recepcion electronica
</commit_message>
<xml_diff>
--- a/documentacion/word/RecepcionElectronica/DF-RE-001-Funcional.docx
+++ b/documentacion/word/RecepcionElectronica/DF-RE-001-Funcional.docx
@@ -758,75 +758,10 @@
     </w:p>
     <w:p>
       <w:pPr>
-        <w:pStyle w:val="Heading2"/>
+        <w:pStyle w:val="ListBullet"/>
       </w:pPr>
-      <w:r/>
-      <w:r>
-        <w:t>1. Objetivo</w:t>
-      </w:r>
-    </w:p>
-    <w:p>
-      <w:r>
-        <w:t xml:space="preserve">Describir, desde una perspectiva funcional, </w:t>
-      </w:r>
-      <w:r>
-        <w:rPr>
-          <w:b/>
-        </w:rPr>
-        <w:t>qué hace</w:t>
-      </w:r>
-      <w:r>
-        <w:t xml:space="preserve"> el producto base de </w:t>
-      </w:r>
-      <w:r>
-        <w:rPr>
-          <w:b/>
-        </w:rPr>
-        <w:t>Recepción Electrónica (RE)</w:t>
-      </w:r>
-      <w:r>
-        <w:t>: los módulos que lo componen, las pantallas y acciones disponibles, las reglas de negocio que rigen su comportamiento, los estados por los que pasa la información y la forma en que fluye entre los distintos procesos de recepción y control de acceso.</w:t>
-      </w:r>
-    </w:p>
-    <w:p>
-      <w:r>
-        <w:t xml:space="preserve">Este documento sirve como referencia funcional para dirección, líderes de proyecto, equipo de implementación y soporte. No describe detalles de programación (esos se encuentran en el Manual Técnico </w:t>
-      </w:r>
-      <w:r>
-        <w:rPr>
-          <w:b/>
-        </w:rPr>
-        <w:t>MT-RE-001</w:t>
-      </w:r>
-      <w:r>
-        <w:t xml:space="preserve">, el Diccionario de Base de Datos </w:t>
-      </w:r>
-      <w:r>
-        <w:rPr>
-          <w:b/>
-        </w:rPr>
-        <w:t>DB-RE-001</w:t>
-      </w:r>
-      <w:r>
-        <w:t xml:space="preserve"> y la documentación de API </w:t>
-      </w:r>
-      <w:r>
-        <w:rPr>
-          <w:b/>
-        </w:rPr>
-        <w:t>API-RE-001</w:t>
-      </w:r>
-      <w:r>
-        <w:t xml:space="preserve">), sino el </w:t>
-      </w:r>
-      <w:r>
-        <w:rPr>
-          <w:b/>
-        </w:rPr>
-        <w:t>comportamiento esperado</w:t>
-      </w:r>
-      <w:r>
-        <w:t xml:space="preserve"> del sistema desde el punto de vista del negocio y del usuario.</w:t>
+      <w:r>
+        <w:t>Ilustración 17. Ciclo de vida de una visita (creación a finalización)</w:t>
       </w:r>
     </w:p>
     <w:p>
@@ -835,6 +770,79 @@
       </w:pPr>
       <w:r/>
       <w:r>
+        <w:t>1. Objetivo</w:t>
+      </w:r>
+    </w:p>
+    <w:p>
+      <w:r>
+        <w:t xml:space="preserve">Describir, desde una perspectiva funcional, </w:t>
+      </w:r>
+      <w:r>
+        <w:rPr>
+          <w:b/>
+        </w:rPr>
+        <w:t>qué hace</w:t>
+      </w:r>
+      <w:r>
+        <w:t xml:space="preserve"> el producto base de </w:t>
+      </w:r>
+      <w:r>
+        <w:rPr>
+          <w:b/>
+        </w:rPr>
+        <w:t>Recepción Electrónica (RE)</w:t>
+      </w:r>
+      <w:r>
+        <w:t>: los módulos que lo componen, las pantallas y acciones disponibles, las reglas de negocio que rigen su comportamiento, los estados por los que pasa la información y la forma en que fluye entre los distintos procesos de recepción y control de acceso.</w:t>
+      </w:r>
+    </w:p>
+    <w:p>
+      <w:r>
+        <w:t xml:space="preserve">Este documento sirve como referencia funcional para dirección, líderes de proyecto, equipo de implementación y soporte. No describe detalles de programación (esos se encuentran en el Manual Técnico </w:t>
+      </w:r>
+      <w:r>
+        <w:rPr>
+          <w:b/>
+        </w:rPr>
+        <w:t>MT-RE-001</w:t>
+      </w:r>
+      <w:r>
+        <w:t xml:space="preserve">, el Diccionario de Base de Datos </w:t>
+      </w:r>
+      <w:r>
+        <w:rPr>
+          <w:b/>
+        </w:rPr>
+        <w:t>DB-RE-001</w:t>
+      </w:r>
+      <w:r>
+        <w:t xml:space="preserve"> y la documentación de API </w:t>
+      </w:r>
+      <w:r>
+        <w:rPr>
+          <w:b/>
+        </w:rPr>
+        <w:t>API-RE-001</w:t>
+      </w:r>
+      <w:r>
+        <w:t xml:space="preserve">), sino el </w:t>
+      </w:r>
+      <w:r>
+        <w:rPr>
+          <w:b/>
+        </w:rPr>
+        <w:t>comportamiento esperado</w:t>
+      </w:r>
+      <w:r>
+        <w:t xml:space="preserve"> del sistema desde el punto de vista del negocio y del usuario.</w:t>
+      </w:r>
+    </w:p>
+    <w:p>
+      <w:pPr>
+        <w:pStyle w:val="Heading2"/>
+      </w:pPr>
+      <w:r/>
+      <w:r>
         <w:t>2. Alcance funcional</w:t>
       </w:r>
     </w:p>
@@ -921,10 +929,10 @@
         <w:rPr>
           <w:b/>
         </w:rPr>
-        <w:t>Gestión de usuarios del sistema</w:t>
-      </w:r>
-      <w:r>
-        <w:t>: alta, roles, permisos, desbloqueo y estado.</w:t>
+        <w:t>Directorio</w:t>
+      </w:r>
+      <w:r>
+        <w:t>: consulta y exportación de empleados activos para operación de recepción.</w:t>
       </w:r>
     </w:p>
     <w:p>
@@ -935,10 +943,10 @@
         <w:rPr>
           <w:b/>
         </w:rPr>
-        <w:t>Control de acceso</w:t>
-      </w:r>
-      <w:r>
-        <w:t>: kiosco de operación, escáner de QR y registro de eventos de entrada/salida.</w:t>
+        <w:t>Gestión de usuarios del sistema</w:t>
+      </w:r>
+      <w:r>
+        <w:t>: alta, roles, permisos, desbloqueo y estado.</w:t>
       </w:r>
     </w:p>
     <w:p>
@@ -949,10 +957,24 @@
         <w:rPr>
           <w:b/>
         </w:rPr>
+        <w:t>Control de acceso</w:t>
+      </w:r>
+      <w:r>
+        <w:t>: kiosco de operación, escáner de QR y registro de eventos de entrada/salida.</w:t>
+      </w:r>
+    </w:p>
+    <w:p>
+      <w:pPr>
+        <w:pStyle w:val="ListBullet"/>
+      </w:pPr>
+      <w:r>
+        <w:rPr>
+          <w:b/>
+        </w:rPr>
         <w:t>Catálogos base</w:t>
       </w:r>
       <w:r>
-        <w:t>: empresas, pisos, accesos, puestos, departamentos, cubículos, horarios y pases.</w:t>
+        <w:t>: empresas, pisos, accesos, puestos, departamentos y cubículos. Horarios y pases existen como catálogos operativos cuando la instalación los mantiene habilitados.</w:t>
       </w:r>
     </w:p>
     <w:p>
@@ -1660,7 +1682,7 @@
           <w:p>
             <w:r/>
             <w:r>
-              <w:t>Usuarios</w:t>
+              <w:t>Directorio</w:t>
             </w:r>
           </w:p>
         </w:tc>
@@ -1671,7 +1693,7 @@
           <w:p>
             <w:r/>
             <w:r>
-              <w:t>Administración de cuentas, roles y permisos.</w:t>
+              <w:t>Consulta y exportación de empleados activos para contacto operativo.</w:t>
             </w:r>
           </w:p>
         </w:tc>
@@ -1684,7 +1706,7 @@
           <w:p>
             <w:r/>
             <w:r>
-              <w:t>Control de acceso</w:t>
+              <w:t>Usuarios</w:t>
             </w:r>
           </w:p>
         </w:tc>
@@ -1695,7 +1717,7 @@
           <w:p>
             <w:r/>
             <w:r>
-              <w:t>Kiosco, escáner QR y eventos de entrada/salida.</w:t>
+              <w:t>Administración de cuentas, roles y permisos.</w:t>
             </w:r>
           </w:p>
         </w:tc>
@@ -1708,7 +1730,7 @@
           <w:p>
             <w:r/>
             <w:r>
-              <w:t>Catálogos</w:t>
+              <w:t>Control de acceso</w:t>
             </w:r>
           </w:p>
         </w:tc>
@@ -1719,7 +1741,7 @@
           <w:p>
             <w:r/>
             <w:r>
-              <w:t>Empresas, pisos, accesos, puestos, departamentos, cubículos, horarios, pases.</w:t>
+              <w:t>Kiosco, escáner QR y eventos de entrada/salida.</w:t>
             </w:r>
           </w:p>
         </w:tc>
@@ -1732,7 +1754,7 @@
           <w:p>
             <w:r/>
             <w:r>
-              <w:t>Reportes</w:t>
+              <w:t>Catálogos</w:t>
             </w:r>
           </w:p>
         </w:tc>
@@ -1743,7 +1765,7 @@
           <w:p>
             <w:r/>
             <w:r>
-              <w:t>Consulta y exportación de visitas, eventos y horas.</w:t>
+              <w:t>Empresas, pisos, accesos, puestos, departamentos, cubículos y, si están habilitados, horarios/pases.</w:t>
             </w:r>
           </w:p>
         </w:tc>
@@ -1756,7 +1778,7 @@
           <w:p>
             <w:r/>
             <w:r>
-              <w:t>Configuración</w:t>
+              <w:t>Reportes</w:t>
             </w:r>
           </w:p>
         </w:tc>
@@ -1767,6 +1789,30 @@
           <w:p>
             <w:r/>
             <w:r>
+              <w:t>Consulta y exportación de visitas, eventos y horas.</w:t>
+            </w:r>
+          </w:p>
+        </w:tc>
+      </w:tr>
+      <w:tr>
+        <w:tc>
+          <w:tcPr>
+            <w:tcW w:type="dxa" w:w="4320"/>
+          </w:tcPr>
+          <w:p>
+            <w:r/>
+            <w:r>
+              <w:t>Configuración</w:t>
+            </w:r>
+          </w:p>
+        </w:tc>
+        <w:tc>
+          <w:tcPr>
+            <w:tcW w:type="dxa" w:w="4320"/>
+          </w:tcPr>
+          <w:p>
+            <w:r/>
+            <w:r>
               <w:t>Parámetros generales, permisos por rol y activación de módulos.</w:t>
             </w:r>
           </w:p>
@@ -1780,7 +1826,18 @@
           <w:rFonts w:ascii="Consolas" w:hAnsi="Consolas"/>
           <w:color w:val="C7254E"/>
         </w:rPr>
-        <w:t>[Foto: panel principal tras iniciar sesión — Ilustración 2]</w:t>
+        <w:t>[Foto: panel principal tras iniciar sesión]</w:t>
+      </w:r>
+    </w:p>
+    <w:p>
+      <w:r>
+        <w:rPr>
+          <w:b/>
+        </w:rPr>
+        <w:t>Ilustración 2.</w:t>
+      </w:r>
+      <w:r>
+        <w:t xml:space="preserve"> Panel principal tras iniciar sesión</w:t>
       </w:r>
     </w:p>
     <w:p>
@@ -2466,7 +2523,7 @@
         <w:t>configuración de correo</w:t>
       </w:r>
       <w:r>
-        <w:t xml:space="preserve"> esté completa. Si no se envían, debe revisarse dicha configuración (ver MA-RE-001).</w:t>
+        <w:t xml:space="preserve"> esté completa. Ante fallas de envío, la configuración se revisa conforme al Manual de Administración (MA-RE-001).</w:t>
       </w:r>
     </w:p>
     <w:p>
@@ -2618,7 +2675,18 @@
           <w:rFonts w:ascii="Consolas" w:hAnsi="Consolas"/>
           <w:color w:val="C7254E"/>
         </w:rPr>
-        <w:t>[Foto: inicio de sesión — Ilustración 1]</w:t>
+        <w:t>[Foto: inicio de sesión]</w:t>
+      </w:r>
+    </w:p>
+    <w:p>
+      <w:r>
+        <w:rPr>
+          <w:b/>
+        </w:rPr>
+        <w:t>Ilustración 1.</w:t>
+      </w:r>
+      <w:r>
+        <w:t xml:space="preserve"> Inicio de sesión</w:t>
       </w:r>
     </w:p>
     <w:p>
@@ -2647,7 +2715,18 @@
           <w:rFonts w:ascii="Consolas" w:hAnsi="Consolas"/>
           <w:color w:val="C7254E"/>
         </w:rPr>
-        <w:t>[Foto: listado de visitantes — Ilustración 3]</w:t>
+        <w:t>[Foto: listado de visitantes]</w:t>
+      </w:r>
+    </w:p>
+    <w:p>
+      <w:r>
+        <w:rPr>
+          <w:b/>
+        </w:rPr>
+        <w:t>Ilustración 3.</w:t>
+      </w:r>
+      <w:r>
+        <w:t xml:space="preserve"> Listado de visitantes</w:t>
       </w:r>
     </w:p>
     <w:p>
@@ -3060,7 +3139,18 @@
           <w:rFonts w:ascii="Consolas" w:hAnsi="Consolas"/>
           <w:color w:val="C7254E"/>
         </w:rPr>
-        <w:t>[Foto: verificación de visitante — Ilustración 5]</w:t>
+        <w:t>[Foto: verificación de visitante]</w:t>
+      </w:r>
+    </w:p>
+    <w:p>
+      <w:r>
+        <w:rPr>
+          <w:b/>
+        </w:rPr>
+        <w:t>Ilustración 5.</w:t>
+      </w:r>
+      <w:r>
+        <w:t xml:space="preserve"> Verificación de visitante</w:t>
       </w:r>
     </w:p>
     <w:p>
@@ -3089,7 +3179,18 @@
           <w:rFonts w:ascii="Consolas" w:hAnsi="Consolas"/>
           <w:color w:val="C7254E"/>
         </w:rPr>
-        <w:t>[Foto: bitácora de visitas — Ilustración 6]</w:t>
+        <w:t>[Foto: bitácora de visitas]</w:t>
+      </w:r>
+    </w:p>
+    <w:p>
+      <w:r>
+        <w:rPr>
+          <w:b/>
+        </w:rPr>
+        <w:t>Ilustración 6.</w:t>
+      </w:r>
+      <w:r>
+        <w:t xml:space="preserve"> Bitácora de visitas</w:t>
       </w:r>
     </w:p>
     <w:p>
@@ -3485,7 +3586,18 @@
           <w:rFonts w:ascii="Consolas" w:hAnsi="Consolas"/>
           <w:color w:val="C7254E"/>
         </w:rPr>
-        <w:t>[Foto: nuevo registro de visita — Ilustración 7]</w:t>
+        <w:t>[Foto: nuevo registro de visita]</w:t>
+      </w:r>
+    </w:p>
+    <w:p>
+      <w:r>
+        <w:rPr>
+          <w:b/>
+        </w:rPr>
+        <w:t>Ilustración 7.</w:t>
+      </w:r>
+      <w:r>
+        <w:t xml:space="preserve"> Nuevo registro de visita</w:t>
       </w:r>
     </w:p>
     <w:p>
@@ -3591,7 +3703,18 @@
           <w:rFonts w:ascii="Consolas" w:hAnsi="Consolas"/>
           <w:color w:val="C7254E"/>
         </w:rPr>
-        <w:t>[Foto: envío de liga de registro — Ilustración 8]</w:t>
+        <w:t>[Foto: envío de liga de registro]</w:t>
+      </w:r>
+    </w:p>
+    <w:p>
+      <w:r>
+        <w:rPr>
+          <w:b/>
+        </w:rPr>
+        <w:t>Ilustración 8.</w:t>
+      </w:r>
+      <w:r>
+        <w:t xml:space="preserve"> Envío de liga de registro</w:t>
       </w:r>
     </w:p>
     <w:p>
@@ -3600,7 +3723,18 @@
           <w:rFonts w:ascii="Consolas" w:hAnsi="Consolas"/>
           <w:color w:val="C7254E"/>
         </w:rPr>
-        <w:t>[Foto: registro desde la liga (visitante) — Ilustración 9]</w:t>
+        <w:t>[Foto: registro desde la liga (visitante)]</w:t>
+      </w:r>
+    </w:p>
+    <w:p>
+      <w:r>
+        <w:rPr>
+          <w:b/>
+        </w:rPr>
+        <w:t>Ilustración 9.</w:t>
+      </w:r>
+      <w:r>
+        <w:t xml:space="preserve"> Registro desde la liga (visitante)</w:t>
       </w:r>
     </w:p>
     <w:p>
@@ -3629,7 +3763,18 @@
           <w:rFonts w:ascii="Consolas" w:hAnsi="Consolas"/>
           <w:color w:val="C7254E"/>
         </w:rPr>
-        <w:t>[Foto: listado de empleados — Ilustración 10]</w:t>
+        <w:t>[Foto: listado de empleados]</w:t>
+      </w:r>
+    </w:p>
+    <w:p>
+      <w:r>
+        <w:rPr>
+          <w:b/>
+        </w:rPr>
+        <w:t>Ilustración 10.</w:t>
+      </w:r>
+      <w:r>
+        <w:t xml:space="preserve"> Listado de empleados</w:t>
       </w:r>
     </w:p>
     <w:p>
@@ -3956,13 +4101,54 @@
         <w:t>generación de QR</w:t>
       </w:r>
       <w:r>
-        <w:t xml:space="preserve"> y </w:t>
+        <w:t xml:space="preserve"> y consulta desde </w:t>
       </w:r>
       <w:r>
         <w:rPr>
           <w:b/>
         </w:rPr>
-        <w:t>directorio</w:t>
+        <w:t>Directorio</w:t>
+      </w:r>
+      <w:r>
+        <w:t>.</w:t>
+      </w:r>
+    </w:p>
+    <w:p>
+      <w:r>
+        <w:rPr>
+          <w:b/>
+        </w:rPr>
+        <w:t>Directorio:</w:t>
+      </w:r>
+    </w:p>
+    <w:p>
+      <w:pPr>
+        <w:pStyle w:val="ListBullet"/>
+      </w:pPr>
+      <w:r>
+        <w:t>Permite consultar empleados activos y datos de contacto/ubicación sin entrar al flujo completo de administración.</w:t>
+      </w:r>
+    </w:p>
+    <w:p>
+      <w:pPr>
+        <w:pStyle w:val="ListBullet"/>
+      </w:pPr>
+      <w:r>
+        <w:t>Puede exportar el directorio para apoyo operativo.</w:t>
+      </w:r>
+    </w:p>
+    <w:p>
+      <w:pPr>
+        <w:pStyle w:val="ListBullet"/>
+      </w:pPr>
+      <w:r>
+        <w:t xml:space="preserve">Es principalmente de consulta; altas, bajas y cambios de información se realizan desde </w:t>
+      </w:r>
+      <w:r>
+        <w:rPr>
+          <w:b/>
+        </w:rPr>
+        <w:t>Empleados</w:t>
       </w:r>
       <w:r>
         <w:t>.</w:t>
@@ -3994,7 +4180,18 @@
           <w:rFonts w:ascii="Consolas" w:hAnsi="Consolas"/>
           <w:color w:val="C7254E"/>
         </w:rPr>
-        <w:t>[Foto: listado de usuarios — Ilustración 11]</w:t>
+        <w:t>[Foto: listado de usuarios]</w:t>
+      </w:r>
+    </w:p>
+    <w:p>
+      <w:r>
+        <w:rPr>
+          <w:b/>
+        </w:rPr>
+        <w:t>Ilustración 11.</w:t>
+      </w:r>
+      <w:r>
+        <w:t xml:space="preserve"> Listado de usuarios</w:t>
       </w:r>
     </w:p>
     <w:p>
@@ -4438,7 +4635,18 @@
           <w:rFonts w:ascii="Consolas" w:hAnsi="Consolas"/>
           <w:color w:val="C7254E"/>
         </w:rPr>
-        <w:t>[Foto: escáner QR validando un acceso — Ilustración 12]</w:t>
+        <w:t>[Foto: escáner QR validando un acceso]</w:t>
+      </w:r>
+    </w:p>
+    <w:p>
+      <w:r>
+        <w:rPr>
+          <w:b/>
+        </w:rPr>
+        <w:t>Ilustración 12.</w:t>
+      </w:r>
+      <w:r>
+        <w:t xml:space="preserve"> Escáner QR validando un acceso</w:t>
       </w:r>
     </w:p>
     <w:p>
@@ -4447,7 +4655,18 @@
           <w:rFonts w:ascii="Consolas" w:hAnsi="Consolas"/>
           <w:color w:val="C7254E"/>
         </w:rPr>
-        <w:t>[Foto: eventos de acceso — Ilustración 13]</w:t>
+        <w:t>[Foto: eventos de acceso]</w:t>
+      </w:r>
+    </w:p>
+    <w:p>
+      <w:r>
+        <w:rPr>
+          <w:b/>
+        </w:rPr>
+        <w:t>Ilustración 13.</w:t>
+      </w:r>
+      <w:r>
+        <w:t xml:space="preserve"> Eventos de acceso</w:t>
       </w:r>
     </w:p>
     <w:p>
@@ -4473,10 +4692,28 @@
         <w:rPr>
           <w:b/>
         </w:rPr>
-        <w:t>empresas, pisos, accesos, puestos, departamentos, cubículos, horarios y pases</w:t>
-      </w:r>
-      <w:r>
-        <w:t>.</w:t>
+        <w:t>empresas, pisos, accesos, puestos, departamentos y cubículos</w:t>
+      </w:r>
+      <w:r>
+        <w:t xml:space="preserve">. Los catálogos de </w:t>
+      </w:r>
+      <w:r>
+        <w:rPr>
+          <w:b/>
+        </w:rPr>
+        <w:t>horarios</w:t>
+      </w:r>
+      <w:r>
+        <w:t xml:space="preserve"> y </w:t>
+      </w:r>
+      <w:r>
+        <w:rPr>
+          <w:b/>
+        </w:rPr>
+        <w:t>pases</w:t>
+      </w:r>
+      <w:r>
+        <w:t xml:space="preserve"> existen como componentes operativos cuando la instalación los mantiene habilitados.</w:t>
       </w:r>
     </w:p>
     <w:p>
@@ -4485,7 +4722,18 @@
           <w:rFonts w:ascii="Consolas" w:hAnsi="Consolas"/>
           <w:color w:val="C7254E"/>
         </w:rPr>
-        <w:t>[Foto: catálogos — Ilustración 14]</w:t>
+        <w:t>[Foto: catálogos]</w:t>
+      </w:r>
+    </w:p>
+    <w:p>
+      <w:r>
+        <w:rPr>
+          <w:b/>
+        </w:rPr>
+        <w:t>Ilustración 14.</w:t>
+      </w:r>
+      <w:r>
+        <w:t xml:space="preserve"> Catálogos</w:t>
       </w:r>
     </w:p>
     <w:p>
@@ -4642,7 +4890,18 @@
           <w:rFonts w:ascii="Consolas" w:hAnsi="Consolas"/>
           <w:color w:val="C7254E"/>
         </w:rPr>
-        <w:t>[Foto: reportes con filtros — Ilustración 15]</w:t>
+        <w:t>[Foto: reportes con filtros]</w:t>
+      </w:r>
+    </w:p>
+    <w:p>
+      <w:r>
+        <w:rPr>
+          <w:b/>
+        </w:rPr>
+        <w:t>Ilustración 15.</w:t>
+      </w:r>
+      <w:r>
+        <w:t xml:space="preserve"> Reportes con filtros</w:t>
       </w:r>
     </w:p>
     <w:p>
@@ -4727,7 +4986,18 @@
           <w:rFonts w:ascii="Consolas" w:hAnsi="Consolas"/>
           <w:color w:val="C7254E"/>
         </w:rPr>
-        <w:t>[Foto: configuración general — Ilustración 16]</w:t>
+        <w:t>[Foto: configuración general]</w:t>
+      </w:r>
+    </w:p>
+    <w:p>
+      <w:r>
+        <w:rPr>
+          <w:b/>
+        </w:rPr>
+        <w:t>Ilustración 16.</w:t>
+      </w:r>
+      <w:r>
+        <w:t xml:space="preserve"> Configuración general</w:t>
       </w:r>
     </w:p>
     <w:p>
@@ -5038,6 +5308,17 @@
           <w:color w:val="C7254E"/>
         </w:rPr>
         <w:t>[Foto: secuencia de un registro desde su creación hasta su finalización]</w:t>
+      </w:r>
+    </w:p>
+    <w:p>
+      <w:r>
+        <w:rPr>
+          <w:b/>
+        </w:rPr>
+        <w:t>Ilustración 17.</w:t>
+      </w:r>
+      <w:r>
+        <w:t xml:space="preserve"> Ciclo de vida de una visita (creación a finalización)</w:t>
       </w:r>
     </w:p>
     <w:p>
@@ -5647,6 +5928,74 @@
             <w:r/>
             <w:r>
               <w:t>Empleados</w:t>
+            </w:r>
+          </w:p>
+        </w:tc>
+        <w:tc>
+          <w:tcPr>
+            <w:tcW w:type="dxa" w:w="1440"/>
+          </w:tcPr>
+          <w:p>
+            <w:r/>
+            <w:r>
+              <w:t>Sí</w:t>
+            </w:r>
+          </w:p>
+        </w:tc>
+        <w:tc>
+          <w:tcPr>
+            <w:tcW w:type="dxa" w:w="1440"/>
+          </w:tcPr>
+          <w:p>
+            <w:r/>
+            <w:r>
+              <w:t>Sí</w:t>
+            </w:r>
+          </w:p>
+        </w:tc>
+        <w:tc>
+          <w:tcPr>
+            <w:tcW w:type="dxa" w:w="1440"/>
+          </w:tcPr>
+          <w:p>
+            <w:r/>
+            <w:r>
+              <w:t>—</w:t>
+            </w:r>
+          </w:p>
+        </w:tc>
+        <w:tc>
+          <w:tcPr>
+            <w:tcW w:type="dxa" w:w="1440"/>
+          </w:tcPr>
+          <w:p>
+            <w:r/>
+            <w:r>
+              <w:t>—</w:t>
+            </w:r>
+          </w:p>
+        </w:tc>
+        <w:tc>
+          <w:tcPr>
+            <w:tcW w:type="dxa" w:w="1440"/>
+          </w:tcPr>
+          <w:p>
+            <w:r/>
+            <w:r>
+              <w:t>—</w:t>
+            </w:r>
+          </w:p>
+        </w:tc>
+      </w:tr>
+      <w:tr>
+        <w:tc>
+          <w:tcPr>
+            <w:tcW w:type="dxa" w:w="1440"/>
+          </w:tcPr>
+          <w:p>
+            <w:r/>
+            <w:r>
+              <w:t>Directorio</w:t>
             </w:r>
           </w:p>
         </w:tc>

</xml_diff>